<commit_message>
Replace resume with concise one-page version
</commit_message>
<xml_diff>
--- a/assets/manvinder-arora-360-resume.docx
+++ b/assets/manvinder-arora-360-resume.docx
@@ -4,7 +4,7 @@
   <w:body>
     <w:p>
       <w:pPr>
-        <w:spacing w:before="0" w:after="20"/>
+        <w:spacing w:before="0" w:after="0"/>
       </w:pPr>
       <w:r>
         <w:rPr>
@@ -12,14 +12,14 @@
           <w:b/>
           <w:i w:val="0"/>
           <w:color w:val="14191D"/>
-          <w:sz w:val="46"/>
+          <w:sz w:val="41"/>
         </w:rPr>
         <w:t>MANVINDER ARORA</w:t>
       </w:r>
     </w:p>
     <w:p>
       <w:pPr>
-        <w:spacing w:before="0" w:after="80"/>
+        <w:spacing w:before="0" w:after="50"/>
       </w:pPr>
       <w:r>
         <w:rPr>
@@ -27,16 +27,16 @@
           <w:b/>
           <w:i w:val="0"/>
           <w:color w:val="087B68"/>
-          <w:sz w:val="19"/>
+          <w:sz w:val="17"/>
         </w:rPr>
-        <w:t>CRYPTO-NATIVE OPERATOR | GROWTH, MARKETING, COMMUNITY, BD &amp; AI BUILDER</w:t>
+        <w:t>CRYPTO-NATIVE OPERATOR &amp; AI BUILDER</w:t>
       </w:r>
     </w:p>
     <w:p>
       <w:pPr>
-        <w:spacing w:before="0" w:after="120"/>
+        <w:spacing w:before="0" w:after="80"/>
         <w:pBdr>
-          <w:bottom w:val="single" w:sz="12" w:space="5" w:color="087B68"/>
+          <w:bottom w:val="single" w:sz="10" w:space="4" w:color="087B68"/>
         </w:pBdr>
       </w:pPr>
       <w:r>
@@ -45,18 +45,18 @@
           <w:b w:val="0"/>
           <w:i w:val="0"/>
           <w:color w:val="525C64"/>
-          <w:sz w:val="17"/>
+          <w:sz w:val="16"/>
         </w:rPr>
         <w:t xml:space="preserve">India (UTC+5:30)  |  </w:t>
       </w:r>
       <w:hyperlink r:id="rId10">
         <w:r>
           <w:rPr>
+            <w:rFonts w:ascii="Arial" w:hAnsi="Arial"/>
             <w:color w:val="525C64"/>
-            <w:rFonts w:ascii="Arial" w:hAnsi="Arial"/>
-            <w:sz w:val="17"/>
+            <w:sz w:val="16"/>
           </w:rPr>
-          <w:t xml:space="preserve">mani.arora03@gmail.com</w:t>
+          <w:t xml:space="preserve">Email</w:t>
         </w:r>
       </w:hyperlink>
       <w:r>
@@ -65,16 +65,16 @@
           <w:b w:val="0"/>
           <w:i w:val="0"/>
           <w:color w:val="525C64"/>
-          <w:sz w:val="17"/>
+          <w:sz w:val="16"/>
         </w:rPr>
         <w:t xml:space="preserve">  |  </w:t>
       </w:r>
       <w:hyperlink r:id="rId11">
         <w:r>
           <w:rPr>
+            <w:rFonts w:ascii="Arial" w:hAnsi="Arial"/>
             <w:color w:val="525C64"/>
-            <w:rFonts w:ascii="Arial" w:hAnsi="Arial"/>
-            <w:sz w:val="17"/>
+            <w:sz w:val="16"/>
           </w:rPr>
           <w:t xml:space="preserve">X</w:t>
         </w:r>
@@ -85,16 +85,16 @@
           <w:b w:val="0"/>
           <w:i w:val="0"/>
           <w:color w:val="525C64"/>
-          <w:sz w:val="17"/>
+          <w:sz w:val="16"/>
         </w:rPr>
         <w:t xml:space="preserve">  |  </w:t>
       </w:r>
       <w:hyperlink r:id="rId12">
         <w:r>
           <w:rPr>
+            <w:rFonts w:ascii="Arial" w:hAnsi="Arial"/>
             <w:color w:val="525C64"/>
-            <w:rFonts w:ascii="Arial" w:hAnsi="Arial"/>
-            <w:sz w:val="17"/>
+            <w:sz w:val="16"/>
           </w:rPr>
           <w:t xml:space="preserve">LinkedIn</w:t>
         </w:r>
@@ -105,16 +105,16 @@
           <w:b w:val="0"/>
           <w:i w:val="0"/>
           <w:color w:val="525C64"/>
-          <w:sz w:val="17"/>
+          <w:sz w:val="16"/>
         </w:rPr>
         <w:t xml:space="preserve">  |  </w:t>
       </w:r>
       <w:hyperlink r:id="rId13">
         <w:r>
           <w:rPr>
+            <w:rFonts w:ascii="Arial" w:hAnsi="Arial"/>
             <w:color w:val="525C64"/>
-            <w:rFonts w:ascii="Arial" w:hAnsi="Arial"/>
-            <w:sz w:val="17"/>
+            <w:sz w:val="16"/>
           </w:rPr>
           <w:t xml:space="preserve">Substack</w:t>
         </w:r>
@@ -125,16 +125,16 @@
           <w:b w:val="0"/>
           <w:i w:val="0"/>
           <w:color w:val="525C64"/>
-          <w:sz w:val="17"/>
+          <w:sz w:val="16"/>
         </w:rPr>
         <w:t xml:space="preserve">  |  </w:t>
       </w:r>
       <w:hyperlink r:id="rId14">
         <w:r>
           <w:rPr>
+            <w:rFonts w:ascii="Arial" w:hAnsi="Arial"/>
             <w:color w:val="525C64"/>
-            <w:rFonts w:ascii="Arial" w:hAnsi="Arial"/>
-            <w:sz w:val="17"/>
+            <w:sz w:val="16"/>
           </w:rPr>
           <w:t xml:space="preserve">Portfolio</w:t>
         </w:r>
@@ -142,23 +142,7 @@
     </w:p>
     <w:p>
       <w:pPr>
-        <w:pStyle w:val="Heading1"/>
-        <w:keepNext/>
-      </w:pPr>
-      <w:r>
-        <w:rPr>
-          <w:rFonts w:ascii="Arial" w:hAnsi="Arial"/>
-          <w:b/>
-          <w:i w:val="0"/>
-          <w:color w:val="087B68"/>
-          <w:sz w:val="20"/>
-        </w:rPr>
-        <w:t>PROFILE</w:t>
-      </w:r>
-    </w:p>
-    <w:p>
-      <w:pPr>
-        <w:spacing w:before="0" w:after="80" w:line="259" w:lineRule="auto"/>
+        <w:spacing w:before="60" w:after="70" w:line="254" w:lineRule="auto"/>
       </w:pPr>
       <w:r>
         <w:rPr>
@@ -166,40 +150,9 @@
           <w:b w:val="0"/>
           <w:i w:val="0"/>
           <w:color w:val="14191D"/>
-          <w:sz w:val="18"/>
+          <w:sz w:val="17"/>
         </w:rPr>
-        <w:t>Crypto-native operator with five years across DeFi community, content, growth, marketing, business development, liquidity and go-to-market. My arc began in community and product education at Timeswap, expanded into marketing and BD leadership at FusionX, and now includes active onchain trading, independent research, long-form writing and AI-assisted personal tools. I combine operator execution with a real user lens: I understand how products are explained, distributed, funded, used and improved.</w:t>
-      </w:r>
-    </w:p>
-    <w:p>
-      <w:pPr>
-        <w:spacing w:before="20" w:after="100" w:line="240" w:lineRule="auto"/>
-      </w:pPr>
-      <w:r>
-        <w:rPr>
-          <w:rFonts w:ascii="Arial" w:hAnsi="Arial"/>
-          <w:b/>
-          <w:i w:val="0"/>
-          <w:color w:val="525C64"/>
-          <w:sz w:val="16"/>
-        </w:rPr>
-        <w:t>COMMUNITY &amp; EDUCATION  -&gt;  CONTENT &amp; MARKETING  -&gt;  GROWTH &amp; BD  -&gt;  LIQUIDITY &amp; GTM  -&gt;  MARKETS, RESEARCH &amp; AI SYSTEMS</w:t>
-      </w:r>
-    </w:p>
-    <w:p>
-      <w:pPr>
-        <w:pStyle w:val="Heading1"/>
-        <w:keepNext/>
-      </w:pPr>
-      <w:r>
-        <w:rPr>
-          <w:rFonts w:ascii="Arial" w:hAnsi="Arial"/>
-          <w:b/>
-          <w:i w:val="0"/>
-          <w:color w:val="087B68"/>
-          <w:sz w:val="20"/>
-        </w:rPr>
-        <w:t>SELECTED IMPACT</w:t>
+        <w:t>Crypto-native operator with five years across community, content, growth, marketing and business development. I helped Timeswap grow TVL by about 50%, brought in repeat LPs with roughly $290K in starting capital, helped scale large communities, and later supported FusionX launches tied to $100M+ in 30-day volume. Outside work, I trade onchain, write about markets and build small AI tools that make my own workflows easier.</w:t>
       </w:r>
     </w:p>
     <w:tbl>
@@ -209,9 +162,12 @@
         <w:tblLook w:firstColumn="1" w:firstRow="1" w:lastColumn="0" w:lastRow="0" w:noHBand="0" w:noVBand="1" w:val="04A0"/>
       </w:tblPr>
       <w:tblGrid>
-        <w:gridCol w:w="3523"/>
-        <w:gridCol w:w="3523"/>
-        <w:gridCol w:w="3523"/>
+        <w:gridCol w:w="1790"/>
+        <w:gridCol w:w="1790"/>
+        <w:gridCol w:w="1790"/>
+        <w:gridCol w:w="1790"/>
+        <w:gridCol w:w="1790"/>
+        <w:gridCol w:w="1790"/>
       </w:tblGrid>
       <w:tr>
         <w:trPr>
@@ -219,13 +175,14 @@
         </w:trPr>
         <w:tc>
           <w:tcPr>
-            <w:tcW w:type="dxa" w:w="3499"/>
+            <w:tcW w:type="dxa" w:w="1786"/>
+            <w:vAlign w:val="center"/>
             <w:shd w:fill="F2F5F4"/>
-            <w:vAlign w:val="center"/>
           </w:tcPr>
           <w:p>
             <w:pPr>
-              <w:spacing w:before="60" w:after="60" w:line="240" w:lineRule="auto"/>
+              <w:spacing w:before="50" w:after="50" w:line="240" w:lineRule="auto"/>
+              <w:jc w:val="center"/>
             </w:pPr>
             <w:r>
               <w:rPr>
@@ -233,7 +190,7 @@
                 <w:b/>
                 <w:i w:val="0"/>
                 <w:color w:val="087B68"/>
-                <w:sz w:val="22"/>
+                <w:sz w:val="19"/>
               </w:rPr>
               <w:t>~50%</w:t>
               <w:br/>
@@ -244,21 +201,22 @@
                 <w:b w:val="0"/>
                 <w:i w:val="0"/>
                 <w:color w:val="525C64"/>
-                <w:sz w:val="15"/>
+                <w:sz w:val="13"/>
               </w:rPr>
-              <w:t>TVL growth supported at Timeswap</w:t>
+              <w:t>TVL growth</w:t>
             </w:r>
           </w:p>
         </w:tc>
         <w:tc>
           <w:tcPr>
-            <w:tcW w:type="dxa" w:w="3499"/>
+            <w:tcW w:type="dxa" w:w="1786"/>
+            <w:vAlign w:val="center"/>
             <w:shd w:fill="F2F5F4"/>
-            <w:vAlign w:val="center"/>
           </w:tcPr>
           <w:p>
             <w:pPr>
-              <w:spacing w:before="60" w:after="60" w:line="240" w:lineRule="auto"/>
+              <w:spacing w:before="50" w:after="50" w:line="240" w:lineRule="auto"/>
+              <w:jc w:val="center"/>
             </w:pPr>
             <w:r>
               <w:rPr>
@@ -266,7 +224,7 @@
                 <w:b/>
                 <w:i w:val="0"/>
                 <w:color w:val="087B68"/>
-                <w:sz w:val="22"/>
+                <w:sz w:val="19"/>
               </w:rPr>
               <w:t>~$290K</w:t>
               <w:br/>
@@ -277,21 +235,22 @@
                 <w:b w:val="0"/>
                 <w:i w:val="0"/>
                 <w:color w:val="525C64"/>
-                <w:sz w:val="15"/>
+                <w:sz w:val="13"/>
               </w:rPr>
-              <w:t>Initial LP allocations sourced</w:t>
+              <w:t>LP capital</w:t>
             </w:r>
           </w:p>
         </w:tc>
         <w:tc>
           <w:tcPr>
-            <w:tcW w:type="dxa" w:w="3485"/>
+            <w:tcW w:type="dxa" w:w="1786"/>
+            <w:vAlign w:val="center"/>
             <w:shd w:fill="F2F5F4"/>
-            <w:vAlign w:val="center"/>
           </w:tcPr>
           <w:p>
             <w:pPr>
-              <w:spacing w:before="60" w:after="60" w:line="240" w:lineRule="auto"/>
+              <w:spacing w:before="50" w:after="50" w:line="240" w:lineRule="auto"/>
+              <w:jc w:val="center"/>
             </w:pPr>
             <w:r>
               <w:rPr>
@@ -299,7 +258,7 @@
                 <w:b/>
                 <w:i w:val="0"/>
                 <w:color w:val="087B68"/>
-                <w:sz w:val="22"/>
+                <w:sz w:val="19"/>
               </w:rPr>
               <w:t>$100M+</w:t>
               <w:br/>
@@ -310,23 +269,22 @@
                 <w:b w:val="0"/>
                 <w:i w:val="0"/>
                 <w:color w:val="525C64"/>
-                <w:sz w:val="15"/>
+                <w:sz w:val="13"/>
               </w:rPr>
-              <w:t>30-day CobaltX volume supported</w:t>
+              <w:t>30-day volume</w:t>
             </w:r>
           </w:p>
         </w:tc>
-      </w:tr>
-      <w:tr>
         <w:tc>
           <w:tcPr>
-            <w:tcW w:type="dxa" w:w="3499"/>
+            <w:tcW w:type="dxa" w:w="1786"/>
+            <w:vAlign w:val="center"/>
             <w:shd w:fill="F2F5F4"/>
-            <w:vAlign w:val="center"/>
           </w:tcPr>
           <w:p>
             <w:pPr>
-              <w:spacing w:before="60" w:after="60" w:line="240" w:lineRule="auto"/>
+              <w:spacing w:before="50" w:after="50" w:line="240" w:lineRule="auto"/>
+              <w:jc w:val="center"/>
             </w:pPr>
             <w:r>
               <w:rPr>
@@ -334,7 +292,7 @@
                 <w:b/>
                 <w:i w:val="0"/>
                 <w:color w:val="087B68"/>
-                <w:sz w:val="22"/>
+                <w:sz w:val="19"/>
               </w:rPr>
               <w:t>150K+</w:t>
               <w:br/>
@@ -345,21 +303,22 @@
                 <w:b w:val="0"/>
                 <w:i w:val="0"/>
                 <w:color w:val="525C64"/>
-                <w:sz w:val="15"/>
+                <w:sz w:val="13"/>
               </w:rPr>
-              <w:t>SummitX followers scaled</w:t>
+              <w:t>brand followers</w:t>
             </w:r>
           </w:p>
         </w:tc>
         <w:tc>
           <w:tcPr>
-            <w:tcW w:type="dxa" w:w="3499"/>
+            <w:tcW w:type="dxa" w:w="1786"/>
+            <w:vAlign w:val="center"/>
             <w:shd w:fill="F2F5F4"/>
-            <w:vAlign w:val="center"/>
           </w:tcPr>
           <w:p>
             <w:pPr>
-              <w:spacing w:before="60" w:after="60" w:line="240" w:lineRule="auto"/>
+              <w:spacing w:before="50" w:after="50" w:line="240" w:lineRule="auto"/>
+              <w:jc w:val="center"/>
             </w:pPr>
             <w:r>
               <w:rPr>
@@ -367,7 +326,7 @@
                 <w:b/>
                 <w:i w:val="0"/>
                 <w:color w:val="087B68"/>
-                <w:sz w:val="22"/>
+                <w:sz w:val="19"/>
               </w:rPr>
               <w:t>50K + 50K</w:t>
               <w:br/>
@@ -378,21 +337,22 @@
                 <w:b w:val="0"/>
                 <w:i w:val="0"/>
                 <w:color w:val="525C64"/>
-                <w:sz w:val="15"/>
+                <w:sz w:val="13"/>
               </w:rPr>
-              <w:t>Timeswap Discord and X reach</w:t>
+              <w:t>Discord + X</w:t>
             </w:r>
           </w:p>
         </w:tc>
         <w:tc>
           <w:tcPr>
-            <w:tcW w:type="dxa" w:w="3485"/>
+            <w:tcW w:type="dxa" w:w="1786"/>
+            <w:vAlign w:val="center"/>
             <w:shd w:fill="F2F5F4"/>
-            <w:vAlign w:val="center"/>
           </w:tcPr>
           <w:p>
             <w:pPr>
-              <w:spacing w:before="60" w:after="60" w:line="240" w:lineRule="auto"/>
+              <w:spacing w:before="50" w:after="50" w:line="240" w:lineRule="auto"/>
+              <w:jc w:val="center"/>
             </w:pPr>
             <w:r>
               <w:rPr>
@@ -400,7 +360,7 @@
                 <w:b/>
                 <w:i w:val="0"/>
                 <w:color w:val="087B68"/>
-                <w:sz w:val="22"/>
+                <w:sz w:val="19"/>
               </w:rPr>
               <w:t>2,000+</w:t>
               <w:br/>
@@ -411,9 +371,9 @@
                 <w:b w:val="0"/>
                 <w:i w:val="0"/>
                 <w:color w:val="525C64"/>
-                <w:sz w:val="15"/>
+                <w:sz w:val="13"/>
               </w:rPr>
-              <w:t>Active users added in one month</w:t>
+              <w:t>campaign users</w:t>
             </w:r>
           </w:p>
         </w:tc>
@@ -430,25 +390,36 @@
           <w:b/>
           <w:i w:val="0"/>
           <w:color w:val="087B68"/>
-          <w:sz w:val="20"/>
+          <w:sz w:val="18"/>
         </w:rPr>
-        <w:t>PROFESSIONAL EXPERIENCE</w:t>
+        <w:t>EXPERIENCE</w:t>
       </w:r>
     </w:p>
     <w:p>
       <w:pPr>
         <w:keepNext/>
-        <w:spacing w:before="80" w:after="60"/>
+        <w:spacing w:before="50" w:after="32"/>
       </w:pPr>
+      <w:hyperlink r:id="rId15">
+        <w:r>
+          <w:rPr>
+            <w:rFonts w:ascii="Arial" w:hAnsi="Arial"/>
+            <w:color w:val="14191D"/>
+            <w:sz w:val="18"/>
+            <w:b/>
+          </w:rPr>
+          <w:t xml:space="preserve">FusionX Finance</w:t>
+        </w:r>
+      </w:hyperlink>
       <w:r>
         <w:rPr>
           <w:rFonts w:ascii="Arial" w:hAnsi="Arial"/>
           <w:b/>
           <w:i w:val="0"/>
           <w:color w:val="14191D"/>
-          <w:sz w:val="20"/>
+          <w:sz w:val="18"/>
         </w:rPr>
-        <w:t>FusionX Finance | Marketing &amp; BD Head</w:t>
+        <w:t xml:space="preserve"> | Marketing &amp; BD Head</w:t>
       </w:r>
       <w:r>
         <w:rPr>
@@ -456,7 +427,7 @@
           <w:b/>
           <w:i w:val="0"/>
           <w:color w:val="525C64"/>
-          <w:sz w:val="17"/>
+          <w:sz w:val="16"/>
         </w:rPr>
         <w:t xml:space="preserve">    Jul 2024 - Mar 2026</w:t>
       </w:r>
@@ -465,8 +436,8 @@
       <w:pPr>
         <w:pStyle w:val="ListBullet"/>
         <w:keepLines/>
-        <w:spacing w:before="0" w:after="50" w:line="257" w:lineRule="auto"/>
-        <w:ind w:left="274" w:hanging="173"/>
+        <w:spacing w:before="0" w:after="32" w:line="247" w:lineRule="auto"/>
+        <w:ind w:left="259" w:hanging="158"/>
       </w:pPr>
       <w:r>
         <w:rPr>
@@ -474,17 +445,17 @@
           <w:b w:val="0"/>
           <w:i w:val="0"/>
           <w:color w:val="14191D"/>
-          <w:sz w:val="18"/>
+          <w:sz w:val="17"/>
         </w:rPr>
-        <w:t>Led marketing, business development and go-to-market across EVM and SVM products, coordinating founders, chain teams, KOLs, communities and launch partners from outreach through execution.</w:t>
+        <w:t>Ran marketing and BD across EVM and SVM products, working with founders, chain teams, KOLs and communities on launches and partner campaigns.</w:t>
       </w:r>
     </w:p>
     <w:p>
       <w:pPr>
         <w:pStyle w:val="ListBullet"/>
         <w:keepLines/>
-        <w:spacing w:before="0" w:after="50" w:line="257" w:lineRule="auto"/>
-        <w:ind w:left="274" w:hanging="173"/>
+        <w:spacing w:before="0" w:after="32" w:line="247" w:lineRule="auto"/>
+        <w:ind w:left="259" w:hanging="158"/>
       </w:pPr>
       <w:r>
         <w:rPr>
@@ -492,17 +463,17 @@
           <w:b w:val="0"/>
           <w:i w:val="0"/>
           <w:color w:val="14191D"/>
-          <w:sz w:val="18"/>
+          <w:sz w:val="17"/>
         </w:rPr>
-        <w:t>Supported CobaltX campaigns that generated more than $100M in 30-day trading volume; shaped launch narratives, partner communication and ecosystem distribution across SOON, svmBASE and svmBNB.</w:t>
+        <w:t>Helped grow SummitX to 150K+ followers and supported CobaltX campaigns tied to more than $100M in trading volume over 30 days.</w:t>
       </w:r>
     </w:p>
     <w:p>
       <w:pPr>
         <w:pStyle w:val="ListBullet"/>
         <w:keepLines/>
-        <w:spacing w:before="0" w:after="50" w:line="257" w:lineRule="auto"/>
-        <w:ind w:left="274" w:hanging="173"/>
+        <w:spacing w:before="0" w:after="32" w:line="247" w:lineRule="auto"/>
+        <w:ind w:left="259" w:hanging="158"/>
       </w:pPr>
       <w:r>
         <w:rPr>
@@ -510,61 +481,36 @@
           <w:b w:val="0"/>
           <w:i w:val="0"/>
           <w:color w:val="14191D"/>
-          <w:sz w:val="18"/>
+          <w:sz w:val="17"/>
         </w:rPr>
-        <w:t>Helped scale SummitX to 150,000+ followers through positioning, content testing, product-led storytelling, memes and ecosystem-native distribution.</w:t>
-      </w:r>
-    </w:p>
-    <w:p>
-      <w:pPr>
-        <w:pStyle w:val="ListBullet"/>
-        <w:keepLines/>
-        <w:spacing w:before="0" w:after="50" w:line="257" w:lineRule="auto"/>
-        <w:ind w:left="274" w:hanging="173"/>
-      </w:pPr>
-      <w:r>
-        <w:rPr>
-          <w:rFonts w:ascii="Arial" w:hAnsi="Arial"/>
-          <w:b w:val="0"/>
-          <w:i w:val="0"/>
-          <w:color w:val="14191D"/>
-          <w:sz w:val="18"/>
-        </w:rPr>
-        <w:t>Built direct communication loops with whales, liquidity providers, traders and power users through X, Telegram and private groups; carried onboarding friction and product feedback back to growth and product teams.</w:t>
-      </w:r>
-    </w:p>
-    <w:p>
-      <w:pPr>
-        <w:pStyle w:val="ListBullet"/>
-        <w:keepLines/>
-        <w:spacing w:before="0" w:after="50" w:line="257" w:lineRule="auto"/>
-        <w:ind w:left="274" w:hanging="173"/>
-      </w:pPr>
-      <w:r>
-        <w:rPr>
-          <w:rFonts w:ascii="Arial" w:hAnsi="Arial"/>
-          <w:b w:val="0"/>
-          <w:i w:val="0"/>
-          <w:color w:val="14191D"/>
-          <w:sz w:val="18"/>
-        </w:rPr>
-        <w:t>Developed co-marketing narratives and partner positioning while writing launch threads, announcements, FAQs, campaign instructions and community updates.</w:t>
+        <w:t>Built direct feedback loops with traders, whales and LPs; turned user friction into clearer content, onboarding and product feedback.</w:t>
       </w:r>
     </w:p>
     <w:p>
       <w:pPr>
         <w:keepNext/>
-        <w:spacing w:before="80" w:after="60"/>
+        <w:spacing w:before="50" w:after="32"/>
       </w:pPr>
+      <w:hyperlink r:id="rId16">
+        <w:r>
+          <w:rPr>
+            <w:rFonts w:ascii="Arial" w:hAnsi="Arial"/>
+            <w:color w:val="14191D"/>
+            <w:sz w:val="18"/>
+            <w:b/>
+          </w:rPr>
+          <w:t xml:space="preserve">Timeswap</w:t>
+        </w:r>
+      </w:hyperlink>
       <w:r>
         <w:rPr>
           <w:rFonts w:ascii="Arial" w:hAnsi="Arial"/>
           <w:b/>
           <w:i w:val="0"/>
           <w:color w:val="14191D"/>
-          <w:sz w:val="20"/>
+          <w:sz w:val="18"/>
         </w:rPr>
-        <w:t>Timeswap | Marketing &amp; Community Head</w:t>
+        <w:t xml:space="preserve"> | Marketing &amp; Community Head</w:t>
       </w:r>
       <w:r>
         <w:rPr>
@@ -572,7 +518,7 @@
           <w:b/>
           <w:i w:val="0"/>
           <w:color w:val="525C64"/>
-          <w:sz w:val="17"/>
+          <w:sz w:val="16"/>
         </w:rPr>
         <w:t xml:space="preserve">    Jul 2021 - Jun 2024</w:t>
       </w:r>
@@ -581,8 +527,8 @@
       <w:pPr>
         <w:pStyle w:val="ListBullet"/>
         <w:keepLines/>
-        <w:spacing w:before="0" w:after="50" w:line="257" w:lineRule="auto"/>
-        <w:ind w:left="274" w:hanging="173"/>
+        <w:spacing w:before="0" w:after="32" w:line="247" w:lineRule="auto"/>
+        <w:ind w:left="259" w:hanging="158"/>
       </w:pPr>
       <w:r>
         <w:rPr>
@@ -590,17 +536,17 @@
           <w:b w:val="0"/>
           <w:i w:val="0"/>
           <w:color w:val="14191D"/>
-          <w:sz w:val="18"/>
+          <w:sz w:val="17"/>
         </w:rPr>
-        <w:t>Helped build the brand, community and user education for an early oracle-less lending protocol across X, Discord and Telegram, translating technical mechanics into clear user actions.</w:t>
+        <w:t>Joined through community and product education, then took on content, growth, campaigns and LP relationships as the protocol grew.</w:t>
       </w:r>
     </w:p>
     <w:p>
       <w:pPr>
         <w:pStyle w:val="ListBullet"/>
         <w:keepLines/>
-        <w:spacing w:before="0" w:after="50" w:line="257" w:lineRule="auto"/>
-        <w:ind w:left="274" w:hanging="173"/>
+        <w:spacing w:before="0" w:after="32" w:line="247" w:lineRule="auto"/>
+        <w:ind w:left="259" w:hanging="158"/>
       </w:pPr>
       <w:r>
         <w:rPr>
@@ -608,17 +554,17 @@
           <w:b w:val="0"/>
           <w:i w:val="0"/>
           <w:color w:val="14191D"/>
-          <w:sz w:val="18"/>
+          <w:sz w:val="17"/>
         </w:rPr>
-        <w:t>Supported approximately 50% TVL growth through LP onboarding, educational content, organic demand generation and demand-led launches without relying on unsustainable token emissions.</w:t>
+        <w:t>Helped support roughly 50% TVL growth and personally onboarded repeat LPs with about $290K in initial capital ($200K, $60K and $30K).</w:t>
       </w:r>
     </w:p>
     <w:p>
       <w:pPr>
         <w:pStyle w:val="ListBullet"/>
         <w:keepLines/>
-        <w:spacing w:before="0" w:after="50" w:line="257" w:lineRule="auto"/>
-        <w:ind w:left="274" w:hanging="173"/>
+        <w:spacing w:before="0" w:after="32" w:line="247" w:lineRule="auto"/>
+        <w:ind w:left="259" w:hanging="158"/>
       </w:pPr>
       <w:r>
         <w:rPr>
@@ -626,17 +572,17 @@
           <w:b w:val="0"/>
           <w:i w:val="0"/>
           <w:color w:val="14191D"/>
-          <w:sz w:val="18"/>
+          <w:sz w:val="17"/>
         </w:rPr>
-        <w:t>Personally sourced and onboarded repeat LPs with approximate initial allocations of $200K, $60K and $30K; reactivated users after fixed-term pools expired when new pools offered compelling opportunities.</w:t>
+        <w:t>Grew and moderated a 50K+ Discord, helped scale X to roughly 50K followers, and ran campaigns that added 2,000+ active users (about 15%) in one month.</w:t>
       </w:r>
     </w:p>
     <w:p>
       <w:pPr>
         <w:pStyle w:val="ListBullet"/>
         <w:keepLines/>
-        <w:spacing w:before="0" w:after="50" w:line="257" w:lineRule="auto"/>
-        <w:ind w:left="274" w:hanging="173"/>
+        <w:spacing w:before="0" w:after="32" w:line="247" w:lineRule="auto"/>
+        <w:ind w:left="259" w:hanging="158"/>
       </w:pPr>
       <w:r>
         <w:rPr>
@@ -644,60 +590,37 @@
           <w:b w:val="0"/>
           <w:i w:val="0"/>
           <w:color w:val="14191D"/>
-          <w:sz w:val="18"/>
+          <w:sz w:val="17"/>
         </w:rPr>
-        <w:t>Grew and moderated a 50,000+ member Discord and helped scale X to roughly 50,000 followers while running daily support, product communication and community programming.</w:t>
-      </w:r>
-    </w:p>
-    <w:p>
-      <w:pPr>
-        <w:pStyle w:val="ListBullet"/>
-        <w:keepLines/>
-        <w:spacing w:before="0" w:after="50" w:line="257" w:lineRule="auto"/>
-        <w:ind w:left="274" w:hanging="173"/>
-      </w:pPr>
-      <w:r>
-        <w:rPr>
-          <w:rFonts w:ascii="Arial" w:hAnsi="Arial"/>
-          <w:b w:val="0"/>
-          <w:i w:val="0"/>
-          <w:color w:val="14191D"/>
-          <w:sz w:val="18"/>
-        </w:rPr>
-        <w:t>Designed and ran Galxe, QuestN and Phi campaigns that added 2,000+ active users (about 15%) in one month; managed eligibility questions, feedback and post-campaign retention.</w:t>
-      </w:r>
-    </w:p>
-    <w:p>
-      <w:pPr>
-        <w:pStyle w:val="ListBullet"/>
-        <w:keepLines/>
-        <w:spacing w:before="0" w:after="50" w:line="257" w:lineRule="auto"/>
-        <w:ind w:left="274" w:hanging="173"/>
-      </w:pPr>
-      <w:r>
-        <w:rPr>
-          <w:rFonts w:ascii="Arial" w:hAnsi="Arial"/>
-          <w:b w:val="0"/>
-          <w:i w:val="0"/>
-          <w:color w:val="14191D"/>
-          <w:sz w:val="18"/>
-        </w:rPr>
-        <w:t>Worked directly with KOLs and community leaders, ensuring they understood the product before promotion and turning recurring user questions into explainers, FAQs and product feedback.</w:t>
-      </w:r>
-    </w:p>
-    <w:p>
-      <w:r>
-        <w:br w:type="page"/>
+        <w:t>Worked directly with KOLs and community leaders; wrote threads, FAQs and launch messages that made oracle-less lending easier to understand.</w:t>
       </w:r>
     </w:p>
     <w:p>
       <w:pPr>
         <w:keepNext/>
-        <w:spacing w:before="0" w:after="140"/>
-        <w:pBdr>
-          <w:bottom w:val="single" w:sz="6" w:space="4" w:color="CFD6D8"/>
-        </w:pBdr>
+        <w:spacing w:before="50" w:after="32"/>
       </w:pPr>
+      <w:hyperlink r:id="rId11">
+        <w:r>
+          <w:rPr>
+            <w:rFonts w:ascii="Arial" w:hAnsi="Arial"/>
+            <w:color w:val="14191D"/>
+            <w:sz w:val="18"/>
+            <w:b/>
+          </w:rPr>
+          <w:t xml:space="preserve">Independent</w:t>
+        </w:r>
+      </w:hyperlink>
+      <w:r>
+        <w:rPr>
+          <w:rFonts w:ascii="Arial" w:hAnsi="Arial"/>
+          <w:b/>
+          <w:i w:val="0"/>
+          <w:color w:val="14191D"/>
+          <w:sz w:val="18"/>
+        </w:rPr>
+        <w:t xml:space="preserve"> | Onchain Trader, Writer &amp; AI Builder</w:t>
+      </w:r>
       <w:r>
         <w:rPr>
           <w:rFonts w:ascii="Arial" w:hAnsi="Arial"/>
@@ -706,32 +629,6 @@
           <w:color w:val="525C64"/>
           <w:sz w:val="16"/>
         </w:rPr>
-        <w:t>MANVINDER ARORA  |  CRYPTO-NATIVE OPERATOR &amp; AI BUILDER</w:t>
-      </w:r>
-    </w:p>
-    <w:p>
-      <w:pPr>
-        <w:keepNext/>
-        <w:spacing w:before="80" w:after="60"/>
-      </w:pPr>
-      <w:r>
-        <w:rPr>
-          <w:rFonts w:ascii="Arial" w:hAnsi="Arial"/>
-          <w:b/>
-          <w:i w:val="0"/>
-          <w:color w:val="14191D"/>
-          <w:sz w:val="20"/>
-        </w:rPr>
-        <w:t>Independent | Onchain Trader, Researcher, Writer &amp; AI Builder</w:t>
-      </w:r>
-      <w:r>
-        <w:rPr>
-          <w:rFonts w:ascii="Arial" w:hAnsi="Arial"/>
-          <w:b/>
-          <w:i w:val="0"/>
-          <w:color w:val="525C64"/>
-          <w:sz w:val="17"/>
-        </w:rPr>
         <w:t xml:space="preserve">    2021 - Present</w:t>
       </w:r>
     </w:p>
@@ -739,8 +636,8 @@
       <w:pPr>
         <w:pStyle w:val="ListBullet"/>
         <w:keepLines/>
-        <w:spacing w:before="0" w:after="50" w:line="257" w:lineRule="auto"/>
-        <w:ind w:left="274" w:hanging="173"/>
+        <w:spacing w:before="0" w:after="32" w:line="247" w:lineRule="auto"/>
+        <w:ind w:left="259" w:hanging="158"/>
       </w:pPr>
       <w:r>
         <w:rPr>
@@ -748,17 +645,17 @@
           <w:b w:val="0"/>
           <w:i w:val="0"/>
           <w:color w:val="14191D"/>
-          <w:sz w:val="18"/>
+          <w:sz w:val="17"/>
         </w:rPr>
-        <w:t>Active user of Hyperliquid, Lighter, Variational, Nado, Aster and emerging venues; received a top-100 allocation in the Lighter airdrop through sustained product usage.</w:t>
+        <w:t>Use Hyperliquid, Lighter, Variational, Nado and Aster as a real trader; received a top-100 Lighter airdrop allocation through sustained product usage.</w:t>
       </w:r>
     </w:p>
     <w:p>
       <w:pPr>
         <w:pStyle w:val="ListBullet"/>
         <w:keepLines/>
-        <w:spacing w:before="0" w:after="50" w:line="257" w:lineRule="auto"/>
-        <w:ind w:left="274" w:hanging="173"/>
+        <w:spacing w:before="0" w:after="32" w:line="247" w:lineRule="auto"/>
+        <w:ind w:left="259" w:hanging="158"/>
       </w:pPr>
       <w:r>
         <w:rPr>
@@ -766,17 +663,17 @@
           <w:b w:val="0"/>
           <w:i w:val="0"/>
           <w:color w:val="14191D"/>
-          <w:sz w:val="18"/>
+          <w:sz w:val="17"/>
         </w:rPr>
-        <w:t>Trade crypto, onchain equities, indices, commodities and other RWA markets; evaluate venues across onboarding, collateral, execution, liquidity, market coverage, fees, funding, points, withdrawals and support.</w:t>
+        <w:t>Trade crypto, onchain equities, indices and commodities; compare venues through execution, liquidity, fees, funding, incentives and the full user journey.</w:t>
       </w:r>
     </w:p>
     <w:p>
       <w:pPr>
         <w:pStyle w:val="ListBullet"/>
         <w:keepLines/>
-        <w:spacing w:before="0" w:after="50" w:line="257" w:lineRule="auto"/>
-        <w:ind w:left="274" w:hanging="173"/>
+        <w:spacing w:before="0" w:after="32" w:line="247" w:lineRule="auto"/>
+        <w:ind w:left="259" w:hanging="158"/>
       </w:pPr>
       <w:r>
         <w:rPr>
@@ -784,27 +681,9 @@
           <w:b w:val="0"/>
           <w:i w:val="0"/>
           <w:color w:val="14191D"/>
-          <w:sz w:val="18"/>
+          <w:sz w:val="17"/>
         </w:rPr>
-        <w:t>Track market narratives, catalysts, leverage, liquidity and trader attention across X, Telegram, protocol documentation and public/onchain data, then form independent market views.</w:t>
-      </w:r>
-    </w:p>
-    <w:p>
-      <w:pPr>
-        <w:pStyle w:val="ListBullet"/>
-        <w:keepLines/>
-        <w:spacing w:before="0" w:after="50" w:line="257" w:lineRule="auto"/>
-        <w:ind w:left="274" w:hanging="173"/>
-      </w:pPr>
-      <w:r>
-        <w:rPr>
-          <w:rFonts w:ascii="Arial" w:hAnsi="Arial"/>
-          <w:b w:val="0"/>
-          <w:i w:val="0"/>
-          <w:color w:val="14191D"/>
-          <w:sz w:val="18"/>
-        </w:rPr>
-        <w:t>Write long-form articles and product commentary about perp DEXs, stablecoins, tokenized markets, community operations, incentives and trader behaviour in simple, crypto-native language.</w:t>
+        <w:t>Write about perp DEXs, stablecoins, tokenized markets and community work, and build personal tools when an existing workflow feels clumsy.</w:t>
       </w:r>
     </w:p>
     <w:p>
@@ -818,14 +697,14 @@
           <w:b/>
           <w:i w:val="0"/>
           <w:color w:val="087B68"/>
-          <w:sz w:val="20"/>
+          <w:sz w:val="18"/>
         </w:rPr>
-        <w:t>SELECTED PERSONAL SYSTEMS</w:t>
+        <w:t>LINKED WORK</w:t>
       </w:r>
     </w:p>
     <w:p>
       <w:pPr>
-        <w:spacing w:before="0" w:after="50" w:line="254" w:lineRule="auto"/>
+        <w:spacing w:before="0" w:after="50" w:line="247" w:lineRule="auto"/>
       </w:pPr>
       <w:r>
         <w:rPr>
@@ -833,24 +712,88 @@
           <w:b/>
           <w:i w:val="0"/>
           <w:color w:val="14191D"/>
-          <w:sz w:val="18"/>
+          <w:sz w:val="17"/>
         </w:rPr>
-        <w:t xml:space="preserve">Crypto Trading Agent: </w:t>
+        <w:t xml:space="preserve">Built for my own use: </w:t>
       </w:r>
+      <w:hyperlink r:id="rId17">
+        <w:r>
+          <w:rPr>
+            <w:rFonts w:ascii="Arial" w:hAnsi="Arial"/>
+            <w:color w:val="087B68"/>
+            <w:sz w:val="16"/>
+            <w:b/>
+          </w:rPr>
+          <w:t xml:space="preserve">Crypto Trading Agent</w:t>
+        </w:r>
+      </w:hyperlink>
       <w:r>
         <w:rPr>
           <w:rFonts w:ascii="Arial" w:hAnsi="Arial"/>
           <w:b w:val="0"/>
           <w:i w:val="0"/>
-          <w:color w:val="14191D"/>
-          <w:sz w:val="18"/>
+          <w:color w:val="525C64"/>
+          <w:sz w:val="16"/>
         </w:rPr>
-        <w:t>Probability-first research and execution dashboard for setup ranking, triggers, trade review, risk context and learning from missed moves.</w:t>
+        <w:t xml:space="preserve">  |  </w:t>
       </w:r>
+      <w:hyperlink r:id="rId18">
+        <w:r>
+          <w:rPr>
+            <w:rFonts w:ascii="Arial" w:hAnsi="Arial"/>
+            <w:color w:val="087B68"/>
+            <w:sz w:val="16"/>
+            <w:b/>
+          </w:rPr>
+          <w:t xml:space="preserve">X-to-Substack</w:t>
+        </w:r>
+      </w:hyperlink>
+      <w:r>
+        <w:rPr>
+          <w:rFonts w:ascii="Arial" w:hAnsi="Arial"/>
+          <w:b w:val="0"/>
+          <w:i w:val="0"/>
+          <w:color w:val="525C64"/>
+          <w:sz w:val="16"/>
+        </w:rPr>
+        <w:t xml:space="preserve">  |  </w:t>
+      </w:r>
+      <w:hyperlink r:id="rId19">
+        <w:r>
+          <w:rPr>
+            <w:rFonts w:ascii="Arial" w:hAnsi="Arial"/>
+            <w:color w:val="087B68"/>
+            <w:sz w:val="16"/>
+            <w:b/>
+          </w:rPr>
+          <w:t xml:space="preserve">Market Bubble Desk</w:t>
+        </w:r>
+      </w:hyperlink>
+      <w:r>
+        <w:rPr>
+          <w:rFonts w:ascii="Arial" w:hAnsi="Arial"/>
+          <w:b w:val="0"/>
+          <w:i w:val="0"/>
+          <w:color w:val="525C64"/>
+          <w:sz w:val="16"/>
+        </w:rPr>
+        <w:t xml:space="preserve">  |  </w:t>
+      </w:r>
+      <w:hyperlink r:id="rId20">
+        <w:r>
+          <w:rPr>
+            <w:rFonts w:ascii="Arial" w:hAnsi="Arial"/>
+            <w:color w:val="087B68"/>
+            <w:sz w:val="16"/>
+            <w:b/>
+          </w:rPr>
+          <w:t xml:space="preserve">AI Digest</w:t>
+        </w:r>
+      </w:hyperlink>
     </w:p>
     <w:p>
       <w:pPr>
-        <w:spacing w:before="0" w:after="50" w:line="254" w:lineRule="auto"/>
+        <w:spacing w:before="0" w:after="50" w:line="247" w:lineRule="auto"/>
       </w:pPr>
       <w:r>
         <w:rPr>
@@ -858,84 +801,61 @@
           <w:b/>
           <w:i w:val="0"/>
           <w:color w:val="14191D"/>
-          <w:sz w:val="18"/>
+          <w:sz w:val="17"/>
         </w:rPr>
-        <w:t xml:space="preserve">X-to-Substack Pipeline: </w:t>
+        <w:t xml:space="preserve">Selected writing: </w:t>
       </w:r>
+      <w:hyperlink r:id="rId21">
+        <w:r>
+          <w:rPr>
+            <w:rFonts w:ascii="Arial" w:hAnsi="Arial"/>
+            <w:color w:val="087B68"/>
+            <w:sz w:val="16"/>
+            <w:b/>
+          </w:rPr>
+          <w:t xml:space="preserve">TradFi became crypto</w:t>
+        </w:r>
+      </w:hyperlink>
       <w:r>
         <w:rPr>
           <w:rFonts w:ascii="Arial" w:hAnsi="Arial"/>
           <w:b w:val="0"/>
           <w:i w:val="0"/>
-          <w:color w:val="14191D"/>
-          <w:sz w:val="18"/>
+          <w:color w:val="525C64"/>
+          <w:sz w:val="16"/>
         </w:rPr>
-        <w:t>Personal writing workflow that turns long-form X articles into reviewable Substack drafts and reconciles published posts.</w:t>
+        <w:t xml:space="preserve">  |  </w:t>
       </w:r>
-    </w:p>
-    <w:p>
-      <w:pPr>
-        <w:spacing w:before="0" w:after="50" w:line="254" w:lineRule="auto"/>
-      </w:pPr>
-      <w:r>
-        <w:rPr>
-          <w:rFonts w:ascii="Arial" w:hAnsi="Arial"/>
-          <w:b/>
-          <w:i w:val="0"/>
-          <w:color w:val="14191D"/>
-          <w:sz w:val="18"/>
-        </w:rPr>
-        <w:t xml:space="preserve">Market Bubble Live Desk: </w:t>
-      </w:r>
+      <w:hyperlink r:id="rId22">
+        <w:r>
+          <w:rPr>
+            <w:rFonts w:ascii="Arial" w:hAnsi="Arial"/>
+            <w:color w:val="087B68"/>
+            <w:sz w:val="16"/>
+            <w:b/>
+          </w:rPr>
+          <w:t xml:space="preserve">The casino should always be open</w:t>
+        </w:r>
+      </w:hyperlink>
       <w:r>
         <w:rPr>
           <w:rFonts w:ascii="Arial" w:hAnsi="Arial"/>
           <w:b w:val="0"/>
           <w:i w:val="0"/>
-          <w:color w:val="14191D"/>
-          <w:sz w:val="18"/>
+          <w:color w:val="525C64"/>
+          <w:sz w:val="16"/>
         </w:rPr>
-        <w:t>Personal production view that combines Twitch, Kick and X signals into questions, clips and show decisions.</w:t>
+        <w:t xml:space="preserve">  |  </w:t>
       </w:r>
-    </w:p>
-    <w:p>
-      <w:pPr>
-        <w:spacing w:before="0" w:after="50" w:line="254" w:lineRule="auto"/>
-      </w:pPr>
-      <w:r>
-        <w:rPr>
-          <w:rFonts w:ascii="Arial" w:hAnsi="Arial"/>
-          <w:b/>
-          <w:i w:val="0"/>
-          <w:color w:val="14191D"/>
-          <w:sz w:val="18"/>
-        </w:rPr>
-        <w:t xml:space="preserve">Substack AI Digest: </w:t>
-      </w:r>
-      <w:r>
-        <w:rPr>
-          <w:rFonts w:ascii="Arial" w:hAnsi="Arial"/>
-          <w:b w:val="0"/>
-          <w:i w:val="0"/>
-          <w:color w:val="14191D"/>
-          <w:sz w:val="18"/>
-        </w:rPr>
-        <w:t>Daily reader that ranks selected AI/Codex posts, removes duplicates and remembers what has already been surfaced.</w:t>
-      </w:r>
-    </w:p>
-    <w:p>
-      <w:pPr>
-        <w:spacing w:before="0" w:after="80"/>
-      </w:pPr>
-      <w:hyperlink r:id="rId14">
+      <w:hyperlink r:id="rId13">
         <w:r>
           <w:rPr>
+            <w:rFonts w:ascii="Arial" w:hAnsi="Arial"/>
             <w:color w:val="087B68"/>
-            <w:rFonts w:ascii="Arial" w:hAnsi="Arial"/>
-            <w:sz w:val="17"/>
+            <w:sz w:val="16"/>
             <w:b/>
           </w:rPr>
-          <w:t xml:space="preserve">View portfolio and public repositories</w:t>
+          <w:t xml:space="preserve">More on Substack</w:t>
         </w:r>
       </w:hyperlink>
     </w:p>
@@ -950,17 +870,14 @@
           <w:b/>
           <w:i w:val="0"/>
           <w:color w:val="087B68"/>
-          <w:sz w:val="20"/>
+          <w:sz w:val="18"/>
         </w:rPr>
-        <w:t>SELECTED WRITING</w:t>
+        <w:t>WHAT I BRING</w:t>
       </w:r>
     </w:p>
     <w:p>
       <w:pPr>
-        <w:pStyle w:val="ListBullet"/>
-        <w:keepLines/>
-        <w:spacing w:before="0" w:after="50" w:line="257" w:lineRule="auto"/>
-        <w:ind w:left="274" w:hanging="173"/>
+        <w:spacing w:before="0" w:after="0" w:line="250" w:lineRule="auto"/>
       </w:pPr>
       <w:r>
         <w:rPr>
@@ -968,256 +885,15 @@
           <w:b w:val="0"/>
           <w:i w:val="0"/>
           <w:color w:val="14191D"/>
-          <w:sz w:val="18"/>
+          <w:sz w:val="17"/>
         </w:rPr>
-        <w:t>Crypto didn't become TradFi. TradFi became crypto - market reflexivity, leverage, narratives and forced selling across global markets.</w:t>
-      </w:r>
-      <w:hyperlink r:id="rId15">
-        <w:r>
-          <w:rPr>
-            <w:color w:val="087B68"/>
-            <w:rFonts w:ascii="Arial" w:hAnsi="Arial"/>
-            <w:sz w:val="17"/>
-            <w:b/>
-          </w:rPr>
-          <w:t xml:space="preserve">  Read</w:t>
-        </w:r>
-      </w:hyperlink>
-    </w:p>
-    <w:p>
-      <w:pPr>
-        <w:pStyle w:val="ListBullet"/>
-        <w:keepLines/>
-        <w:spacing w:before="0" w:after="50" w:line="257" w:lineRule="auto"/>
-        <w:ind w:left="274" w:hanging="173"/>
-      </w:pPr>
-      <w:r>
-        <w:rPr>
-          <w:rFonts w:ascii="Arial" w:hAnsi="Arial"/>
-          <w:b w:val="0"/>
-          <w:i w:val="0"/>
-          <w:color w:val="14191D"/>
-          <w:sz w:val="18"/>
-        </w:rPr>
-        <w:t>The casino should always be open - tokenized assets, stock perpetuals and the move toward always-on markets.</w:t>
-      </w:r>
-      <w:hyperlink r:id="rId16">
-        <w:r>
-          <w:rPr>
-            <w:color w:val="087B68"/>
-            <w:rFonts w:ascii="Arial" w:hAnsi="Arial"/>
-            <w:sz w:val="17"/>
-            <w:b/>
-          </w:rPr>
-          <w:t xml:space="preserve">  Read</w:t>
-        </w:r>
-      </w:hyperlink>
-    </w:p>
-    <w:p>
-      <w:pPr>
-        <w:pStyle w:val="ListBullet"/>
-        <w:keepLines/>
-        <w:spacing w:before="0" w:after="50" w:line="257" w:lineRule="auto"/>
-        <w:ind w:left="274" w:hanging="173"/>
-      </w:pPr>
-      <w:r>
-        <w:rPr>
-          <w:rFonts w:ascii="Arial" w:hAnsi="Arial"/>
-          <w:b w:val="0"/>
-          <w:i w:val="0"/>
-          <w:color w:val="14191D"/>
-          <w:sz w:val="18"/>
-        </w:rPr>
-        <w:t>The Community Manager Is Dead. Long Live the Community Manager - a practical view of community work as product feedback, distribution and trust.</w:t>
-      </w:r>
-      <w:hyperlink r:id="rId13">
-        <w:r>
-          <w:rPr>
-            <w:color w:val="087B68"/>
-            <w:rFonts w:ascii="Arial" w:hAnsi="Arial"/>
-            <w:sz w:val="17"/>
-            <w:b/>
-          </w:rPr>
-          <w:t xml:space="preserve">  More on Substack</w:t>
-        </w:r>
-      </w:hyperlink>
-    </w:p>
-    <w:p>
-      <w:pPr>
-        <w:pStyle w:val="Heading1"/>
-        <w:keepNext/>
-      </w:pPr>
-      <w:r>
-        <w:rPr>
-          <w:rFonts w:ascii="Arial" w:hAnsi="Arial"/>
-          <w:b/>
-          <w:i w:val="0"/>
-          <w:color w:val="087B68"/>
-          <w:sz w:val="20"/>
-        </w:rPr>
-        <w:t>CORE CAPABILITIES</w:t>
-      </w:r>
-    </w:p>
-    <w:p>
-      <w:pPr>
-        <w:spacing w:before="0" w:after="50" w:line="254" w:lineRule="auto"/>
-      </w:pPr>
-      <w:r>
-        <w:rPr>
-          <w:rFonts w:ascii="Arial" w:hAnsi="Arial"/>
-          <w:b/>
-          <w:i w:val="0"/>
-          <w:color w:val="14191D"/>
-          <w:sz w:val="18"/>
-        </w:rPr>
-        <w:t xml:space="preserve">Growth &amp; GTM: </w:t>
-      </w:r>
-      <w:r>
-        <w:rPr>
-          <w:rFonts w:ascii="Arial" w:hAnsi="Arial"/>
-          <w:b w:val="0"/>
-          <w:i w:val="0"/>
-          <w:color w:val="14191D"/>
-          <w:sz w:val="18"/>
-        </w:rPr>
-        <w:t>Organic acquisition, product-led campaigns, activation, retention, reactivation, A/B content testing, launch strategy and ecosystem expansion.</w:t>
-      </w:r>
-    </w:p>
-    <w:p>
-      <w:pPr>
-        <w:spacing w:before="0" w:after="50" w:line="254" w:lineRule="auto"/>
-      </w:pPr>
-      <w:r>
-        <w:rPr>
-          <w:rFonts w:ascii="Arial" w:hAnsi="Arial"/>
-          <w:b/>
-          <w:i w:val="0"/>
-          <w:color w:val="14191D"/>
-          <w:sz w:val="18"/>
-        </w:rPr>
-        <w:t xml:space="preserve">Business Development: </w:t>
-      </w:r>
-      <w:r>
-        <w:rPr>
-          <w:rFonts w:ascii="Arial" w:hAnsi="Arial"/>
-          <w:b w:val="0"/>
-          <w:i w:val="0"/>
-          <w:color w:val="14191D"/>
-          <w:sz w:val="18"/>
-        </w:rPr>
-        <w:t>Founder and partner outreach, LP/whale onboarding, KOL relationships, ecosystem co-marketing, value propositions, follow-up and liquidity activation.</w:t>
-      </w:r>
-    </w:p>
-    <w:p>
-      <w:pPr>
-        <w:spacing w:before="0" w:after="50" w:line="254" w:lineRule="auto"/>
-      </w:pPr>
-      <w:r>
-        <w:rPr>
-          <w:rFonts w:ascii="Arial" w:hAnsi="Arial"/>
-          <w:b/>
-          <w:i w:val="0"/>
-          <w:color w:val="14191D"/>
-          <w:sz w:val="18"/>
-        </w:rPr>
-        <w:t xml:space="preserve">Community &amp; Content: </w:t>
-      </w:r>
-      <w:r>
-        <w:rPr>
-          <w:rFonts w:ascii="Arial" w:hAnsi="Arial"/>
-          <w:b w:val="0"/>
-          <w:i w:val="0"/>
-          <w:color w:val="14191D"/>
-          <w:sz w:val="18"/>
-        </w:rPr>
-        <w:t>X, Discord, Telegram, AMAs, moderation, crisis communication, threads, explainers, FAQs, memes, campaign copy and technical-to-simple writing.</w:t>
-      </w:r>
-    </w:p>
-    <w:p>
-      <w:pPr>
-        <w:spacing w:before="0" w:after="50" w:line="254" w:lineRule="auto"/>
-      </w:pPr>
-      <w:r>
-        <w:rPr>
-          <w:rFonts w:ascii="Arial" w:hAnsi="Arial"/>
-          <w:b/>
-          <w:i w:val="0"/>
-          <w:color w:val="14191D"/>
-          <w:sz w:val="18"/>
-        </w:rPr>
-        <w:t xml:space="preserve">Markets &amp; Product: </w:t>
-      </w:r>
-      <w:r>
-        <w:rPr>
-          <w:rFonts w:ascii="Arial" w:hAnsi="Arial"/>
-          <w:b w:val="0"/>
-          <w:i w:val="0"/>
-          <w:color w:val="14191D"/>
-          <w:sz w:val="18"/>
-        </w:rPr>
-        <w:t>DeFi lending, perp DEXs, stablecoins, RWAs, liquidity, fees, funding, incentives, trader psychology, user journeys and product feedback.</w:t>
-      </w:r>
-    </w:p>
-    <w:p>
-      <w:pPr>
-        <w:spacing w:before="0" w:after="50" w:line="254" w:lineRule="auto"/>
-      </w:pPr>
-      <w:r>
-        <w:rPr>
-          <w:rFonts w:ascii="Arial" w:hAnsi="Arial"/>
-          <w:b/>
-          <w:i w:val="0"/>
-          <w:color w:val="14191D"/>
-          <w:sz w:val="18"/>
-        </w:rPr>
-        <w:t xml:space="preserve">AI &amp; Building: </w:t>
-      </w:r>
-      <w:r>
-        <w:rPr>
-          <w:rFonts w:ascii="Arial" w:hAnsi="Arial"/>
-          <w:b w:val="0"/>
-          <w:i w:val="0"/>
-          <w:color w:val="14191D"/>
-          <w:sz w:val="18"/>
-        </w:rPr>
-        <w:t>ChatGPT, Codex, AI-assisted research, writing and rapid prototyping; Python, Node.js, dashboards, browser automation, RSS and lightweight data workflows.</w:t>
-      </w:r>
-    </w:p>
-    <w:p>
-      <w:pPr>
-        <w:pStyle w:val="Heading1"/>
-        <w:keepNext/>
-      </w:pPr>
-      <w:r>
-        <w:rPr>
-          <w:rFonts w:ascii="Arial" w:hAnsi="Arial"/>
-          <w:b/>
-          <w:i w:val="0"/>
-          <w:color w:val="087B68"/>
-          <w:sz w:val="20"/>
-        </w:rPr>
-        <w:t>WORKING STYLE</w:t>
-      </w:r>
-    </w:p>
-    <w:p>
-      <w:pPr>
-        <w:spacing w:before="0" w:after="0" w:line="259" w:lineRule="auto"/>
-      </w:pPr>
-      <w:r>
-        <w:rPr>
-          <w:rFonts w:ascii="Arial" w:hAnsi="Arial"/>
-          <w:b w:val="0"/>
-          <w:i w:val="0"/>
-          <w:color w:val="14191D"/>
-          <w:sz w:val="18"/>
-        </w:rPr>
-        <w:t>Crypto-native, first-principles and hands-on. Strongest when a role needs someone who can understand the product, speak to users and partners, write clearly, operate inside fast-moving markets, and build a practical tool when the existing workflow is not enough.</w:t>
+        <w:t>Growth, community, content, GTM and partnerships; LP, whale and KOL relationships; DeFi and perp DEX fluency; product feedback; clear writing; ChatGPT, Codex, Python, Node.js and lightweight automation.</w:t>
       </w:r>
     </w:p>
     <w:sectPr>
       <w:footerReference w:type="default" r:id="rId9"/>
       <w:pgSz w:w="12240" w:h="15840"/>
-      <w:pgMar w:top="691" w:right="835" w:bottom="691" w:left="835" w:header="360" w:footer="360" w:gutter="0"/>
+      <w:pgMar w:top="547" w:right="749" w:bottom="490" w:left="749" w:header="288" w:footer="259" w:gutter="0"/>
       <w:cols w:space="720"/>
       <w:docGrid w:linePitch="360"/>
     </w:sectPr>
@@ -1230,21 +906,19 @@
   <w:p>
     <w:pPr>
       <w:pStyle w:val="Footer"/>
-      <w:jc w:val="right"/>
-    </w:pPr>
-    <w:r>
-      <w:rPr>
-        <w:rFonts w:ascii="Arial" w:hAnsi="Arial"/>
-        <w:b w:val="0"/>
-        <w:i w:val="0"/>
-        <w:color w:val="525C64"/>
-        <w:sz w:val="16"/>
-      </w:rPr>
-      <w:t xml:space="preserve">Page </w:t>
-      <w:fldChar w:fldCharType="begin"/>
-      <w:instrText xml:space="preserve">PAGE</w:instrText>
-      <w:fldChar w:fldCharType="end"/>
-    </w:r>
+      <w:spacing w:before="0"/>
+      <w:jc w:val="center"/>
+    </w:pPr>
+    <w:hyperlink r:id="rId1">
+      <w:r>
+        <w:rPr>
+          <w:rFonts w:ascii="Arial" w:hAnsi="Arial"/>
+          <w:color w:val="525C64"/>
+          <w:sz w:val="14"/>
+        </w:rPr>
+        <w:t xml:space="preserve">Portfolio: punkypunk936-coder.github.io/manvinder-portfolio</w:t>
+      </w:r>
+    </w:hyperlink>
   </w:p>
 </w:ftr>
 </file>
@@ -1613,12 +1287,12 @@
     <w:qFormat/>
     <w:rsid w:val="00FC693F"/>
     <w:pPr>
-      <w:spacing w:after="80" w:line="259" w:lineRule="auto"/>
+      <w:spacing w:after="50" w:line="250" w:lineRule="auto"/>
     </w:pPr>
     <w:rPr>
       <w:rFonts w:ascii="Arial" w:hAnsi="Arial"/>
       <w:color w:val="14191D"/>
-      <w:sz w:val="18"/>
+      <w:sz w:val="17"/>
     </w:rPr>
   </w:style>
   <w:style w:type="paragraph" w:styleId="Header">
@@ -1676,7 +1350,7 @@
     <w:pPr>
       <w:keepNext/>
       <w:keepLines/>
-      <w:spacing w:before="160" w:after="80"/>
+      <w:spacing w:before="110" w:after="50"/>
       <w:outlineLvl w:val="0"/>
     </w:pPr>
     <w:rPr>
@@ -1684,7 +1358,7 @@
       <w:b/>
       <w:bCs/>
       <w:color w:val="087B68"/>
-      <w:sz w:val="20"/>
+      <w:sz w:val="18"/>
       <w:szCs w:val="28"/>
     </w:rPr>
   </w:style>
@@ -2151,7 +1825,7 @@
     </w:pPr>
     <w:rPr>
       <w:rFonts w:ascii="Arial" w:hAnsi="Arial"/>
-      <w:sz w:val="18"/>
+      <w:sz w:val="17"/>
     </w:rPr>
   </w:style>
   <w:style w:type="paragraph" w:styleId="ListBullet2">

</xml_diff>

<commit_message>
Refocus portfolio on recruiter proof
</commit_message>
<xml_diff>
--- a/assets/manvinder-arora-360-resume.docx
+++ b/assets/manvinder-arora-360-resume.docx
@@ -152,7 +152,7 @@
           <w:color w:val="14191D"/>
           <w:sz w:val="17"/>
         </w:rPr>
-        <w:t>Crypto-native operator with five years across community, content, growth, marketing and business development. I helped Timeswap grow TVL by about 50%, brought in repeat LPs with roughly $290K in starting capital, helped scale large communities, and later supported FusionX launches tied to $100M+ in 30-day volume. Outside work, I trade onchain, write about markets and build small AI tools that make my own workflows easier.</w:t>
+        <w:t>Crypto-native operator with five years across community, content, growth, marketing and business development. I helped Timeswap grow TVL by about 50%, brought in repeat liquidity providers with roughly $290K in starting capital, helped scale large communities, and later supported FusionX launches tied to $100M+ in 30-day volume. Outside work, I trade onchain, write about markets and build small AI tools that make my own workflows easier.</w:t>
       </w:r>
     </w:p>
     <w:tbl>
@@ -447,7 +447,7 @@
           <w:color w:val="14191D"/>
           <w:sz w:val="17"/>
         </w:rPr>
-        <w:t>Ran marketing and BD across EVM and SVM products, working with founders, chain teams, KOLs and communities on launches and partner campaigns.</w:t>
+        <w:t>Ran marketing and BD across EVM and SVM products, working with founders, chain teams, creators and communities on launches and partner campaigns.</w:t>
       </w:r>
     </w:p>
     <w:p>
@@ -592,7 +592,7 @@
           <w:color w:val="14191D"/>
           <w:sz w:val="17"/>
         </w:rPr>
-        <w:t>Worked directly with KOLs and community leaders; wrote threads, FAQs and launch messages that made oracle-less lending easier to understand.</w:t>
+        <w:t>Worked directly with creators and community leaders; wrote threads, FAQs and launch messages that made oracle-less lending easier to understand.</w:t>
       </w:r>
     </w:p>
     <w:p>
@@ -724,7 +724,7 @@
             <w:sz w:val="16"/>
             <w:b/>
           </w:rPr>
-          <w:t xml:space="preserve">Crypto Trading Agent</w:t>
+          <w:t xml:space="preserve">Meme Scout Agent</w:t>
         </w:r>
       </w:hyperlink>
       <w:r>
@@ -745,7 +745,7 @@
             <w:sz w:val="16"/>
             <w:b/>
           </w:rPr>
-          <w:t xml:space="preserve">X-to-Substack</w:t>
+          <w:t xml:space="preserve">Crypto Trading Agent</w:t>
         </w:r>
       </w:hyperlink>
       <w:r>
@@ -766,28 +766,7 @@
             <w:sz w:val="16"/>
             <w:b/>
           </w:rPr>
-          <w:t xml:space="preserve">Market Bubble Desk</w:t>
-        </w:r>
-      </w:hyperlink>
-      <w:r>
-        <w:rPr>
-          <w:rFonts w:ascii="Arial" w:hAnsi="Arial"/>
-          <w:b w:val="0"/>
-          <w:i w:val="0"/>
-          <w:color w:val="525C64"/>
-          <w:sz w:val="16"/>
-        </w:rPr>
-        <w:t xml:space="preserve">  |  </w:t>
-      </w:r>
-      <w:hyperlink r:id="rId20">
-        <w:r>
-          <w:rPr>
-            <w:rFonts w:ascii="Arial" w:hAnsi="Arial"/>
-            <w:color w:val="087B68"/>
-            <w:sz w:val="16"/>
-            <w:b/>
-          </w:rPr>
-          <w:t xml:space="preserve">AI Digest</w:t>
+          <w:t xml:space="preserve">X-to-Substack</w:t>
         </w:r>
       </w:hyperlink>
     </w:p>
@@ -804,6 +783,27 @@
           <w:sz w:val="17"/>
         </w:rPr>
         <w:t xml:space="preserve">Selected writing: </w:t>
+      </w:r>
+      <w:hyperlink r:id="rId20">
+        <w:r>
+          <w:rPr>
+            <w:rFonts w:ascii="Arial" w:hAnsi="Arial"/>
+            <w:color w:val="087B68"/>
+            <w:sz w:val="16"/>
+            <w:b/>
+          </w:rPr>
+          <w:t xml:space="preserve">Perp DEXs: Crypto's clearest PMF</w:t>
+        </w:r>
+      </w:hyperlink>
+      <w:r>
+        <w:rPr>
+          <w:rFonts w:ascii="Arial" w:hAnsi="Arial"/>
+          <w:b w:val="0"/>
+          <w:i w:val="0"/>
+          <w:color w:val="525C64"/>
+          <w:sz w:val="16"/>
+        </w:rPr>
+        <w:t xml:space="preserve">  |  </w:t>
       </w:r>
       <w:hyperlink r:id="rId21">
         <w:r>
@@ -834,28 +834,7 @@
             <w:sz w:val="16"/>
             <w:b/>
           </w:rPr>
-          <w:t xml:space="preserve">The casino should always be open</w:t>
-        </w:r>
-      </w:hyperlink>
-      <w:r>
-        <w:rPr>
-          <w:rFonts w:ascii="Arial" w:hAnsi="Arial"/>
-          <w:b w:val="0"/>
-          <w:i w:val="0"/>
-          <w:color w:val="525C64"/>
-          <w:sz w:val="16"/>
-        </w:rPr>
-        <w:t xml:space="preserve">  |  </w:t>
-      </w:r>
-      <w:hyperlink r:id="rId13">
-        <w:r>
-          <w:rPr>
-            <w:rFonts w:ascii="Arial" w:hAnsi="Arial"/>
-            <w:color w:val="087B68"/>
-            <w:sz w:val="16"/>
-            <w:b/>
-          </w:rPr>
-          <w:t xml:space="preserve">More on Substack</w:t>
+          <w:t xml:space="preserve">Community manager</w:t>
         </w:r>
       </w:hyperlink>
     </w:p>
@@ -887,7 +866,7 @@
           <w:color w:val="14191D"/>
           <w:sz w:val="17"/>
         </w:rPr>
-        <w:t>Growth, community, content, GTM and partnerships; LP, whale and KOL relationships; DeFi and perp DEX fluency; product feedback; clear writing; ChatGPT, Codex, Python, Node.js and lightweight automation.</w:t>
+        <w:t>Growth, community, content, GTM and partnerships; liquidity-provider, whale and creator relationships; DeFi and perp DEX fluency; product feedback; clear writing; AI-assisted workflow design.</w:t>
       </w:r>
     </w:p>
     <w:sectPr>

</xml_diff>